<commit_message>
docs(seo): update brand information form
Alaa
</commit_message>
<xml_diff>
--- a/docs/seo/Elite-Brand-Information-Form.docx
+++ b/docs/seo/Elite-Brand-Information-Form.docx
@@ -5467,6 +5467,15 @@
             </w:r>
             <w:r>
               <w:rPr>
+                <w:color w:val="1f2a26"/>
+                <w:sz w:val="19"/>
+                <w:szCs w:val="19"/>
+                <w:rtl w:val="0"/>
+              </w:rPr>
+              <w:t xml:space="preserve">WhatsApp :24/7 - Phone : WORKING HOURS</w:t>
+            </w:r>
+            <w:r>
+              <w:rPr>
                 <w:rtl w:val="0"/>
               </w:rPr>
             </w:r>
@@ -5574,6 +5583,15 @@
             </w:r>
             <w:r>
               <w:rPr>
+                <w:color w:val="1f2a26"/>
+                <w:sz w:val="19"/>
+                <w:szCs w:val="19"/>
+                <w:rtl w:val="0"/>
+              </w:rPr>
+              <w:t xml:space="preserve">2 days Eid al Fetr - 1 days eid al idha</w:t>
+            </w:r>
+            <w:r>
+              <w:rPr>
                 <w:rtl w:val="0"/>
               </w:rPr>
             </w:r>
@@ -5677,7 +5695,7 @@
                 <w:szCs w:val="19"/>
                 <w:rtl w:val="0"/>
               </w:rPr>
-              <w:t xml:space="preserve"> </w:t>
+              <w:t xml:space="preserve"> 1pm to 1 am</w:t>
             </w:r>
             <w:r>
               <w:rPr>
@@ -5901,7 +5919,16 @@
                 <w:szCs w:val="19"/>
                 <w:rtl w:val="0"/>
               </w:rPr>
-              <w:t xml:space="preserve"> </w:t>
+              <w:t xml:space="preserve"> 1</w:t>
+            </w:r>
+            <w:r>
+              <w:rPr>
+                <w:color w:val="1f2a26"/>
+                <w:sz w:val="19"/>
+                <w:szCs w:val="19"/>
+                <w:rtl w:val="0"/>
+              </w:rPr>
+              <w:t xml:space="preserve">day </w:t>
             </w:r>
             <w:r>
               <w:rPr>
@@ -6008,7 +6035,7 @@
                 <w:szCs w:val="19"/>
                 <w:rtl w:val="0"/>
               </w:rPr>
-              <w:t xml:space="preserve"> </w:t>
+              <w:t xml:space="preserve"> no</w:t>
             </w:r>
             <w:r>
               <w:rPr>
@@ -6119,6 +6146,25 @@
             </w:r>
             <w:r>
               <w:rPr>
+                <w:color w:val="1f2a26"/>
+                <w:sz w:val="19"/>
+                <w:szCs w:val="19"/>
+                <w:rtl w:val="0"/>
+              </w:rPr>
+              <w:t xml:space="preserve">A</w:t>
+            </w:r>
+            <w:r>
+              <w:rPr>
+                <w:rFonts w:ascii="Calibri" w:cs="Calibri" w:eastAsia="Calibri" w:hAnsi="Calibri"/>
+                <w:color w:val="1f2a26"/>
+                <w:sz w:val="19"/>
+                <w:szCs w:val="19"/>
+                <w:rtl w:val="0"/>
+              </w:rPr>
+              <w:t xml:space="preserve">ll gcc countries - 3 to 5 business days</w:t>
+            </w:r>
+            <w:r>
+              <w:rPr>
                 <w:rtl w:val="0"/>
               </w:rPr>
             </w:r>
@@ -6226,6 +6272,25 @@
             </w:r>
             <w:r>
               <w:rPr>
+                <w:color w:val="1f2a26"/>
+                <w:sz w:val="19"/>
+                <w:szCs w:val="19"/>
+                <w:rtl w:val="0"/>
+              </w:rPr>
+              <w:t xml:space="preserve">A</w:t>
+            </w:r>
+            <w:r>
+              <w:rPr>
+                <w:rFonts w:ascii="Calibri" w:cs="Calibri" w:eastAsia="Calibri" w:hAnsi="Calibri"/>
+                <w:color w:val="1f2a26"/>
+                <w:sz w:val="19"/>
+                <w:szCs w:val="19"/>
+                <w:rtl w:val="0"/>
+              </w:rPr>
+              <w:t xml:space="preserve">vailable anywhere</w:t>
+            </w:r>
+            <w:r>
+              <w:rPr>
                 <w:rtl w:val="0"/>
               </w:rPr>
             </w:r>
@@ -6308,7 +6373,7 @@
                 <w:szCs w:val="19"/>
                 <w:rtl w:val="0"/>
               </w:rPr>
-              <w:t xml:space="preserve"> </w:t>
+              <w:t xml:space="preserve"> customer</w:t>
             </w:r>
             <w:r>
               <w:rPr>
@@ -6415,7 +6480,7 @@
                 <w:szCs w:val="19"/>
                 <w:rtl w:val="0"/>
               </w:rPr>
-              <w:t xml:space="preserve"> </w:t>
+              <w:t xml:space="preserve"> 7 days </w:t>
             </w:r>
             <w:r>
               <w:rPr>
@@ -6526,6 +6591,25 @@
             </w:r>
             <w:r>
               <w:rPr>
+                <w:color w:val="1f2a26"/>
+                <w:sz w:val="19"/>
+                <w:szCs w:val="19"/>
+                <w:rtl w:val="0"/>
+              </w:rPr>
+              <w:t xml:space="preserve">N</w:t>
+            </w:r>
+            <w:r>
+              <w:rPr>
+                <w:rFonts w:ascii="Calibri" w:cs="Calibri" w:eastAsia="Calibri" w:hAnsi="Calibri"/>
+                <w:color w:val="1f2a26"/>
+                <w:sz w:val="19"/>
+                <w:szCs w:val="19"/>
+                <w:rtl w:val="0"/>
+              </w:rPr>
+              <w:t xml:space="preserve">ew with the original packaging</w:t>
+            </w:r>
+            <w:r>
+              <w:rPr>
                 <w:rtl w:val="0"/>
               </w:rPr>
             </w:r>
@@ -6608,7 +6692,16 @@
                 <w:szCs w:val="19"/>
                 <w:rtl w:val="0"/>
               </w:rPr>
-              <w:t xml:space="preserve"> </w:t>
+              <w:t xml:space="preserve"> cu</w:t>
+            </w:r>
+            <w:r>
+              <w:rPr>
+                <w:color w:val="1f2a26"/>
+                <w:sz w:val="19"/>
+                <w:szCs w:val="19"/>
+                <w:rtl w:val="0"/>
+              </w:rPr>
+              <w:t xml:space="preserve">stomer</w:t>
             </w:r>
             <w:r>
               <w:rPr>
@@ -6694,7 +6787,16 @@
                 <w:szCs w:val="19"/>
                 <w:rtl w:val="0"/>
               </w:rPr>
-              <w:t xml:space="preserve"> </w:t>
+              <w:t xml:space="preserve"> 3 </w:t>
+            </w:r>
+            <w:r>
+              <w:rPr>
+                <w:color w:val="1f2a26"/>
+                <w:sz w:val="19"/>
+                <w:szCs w:val="19"/>
+                <w:rtl w:val="0"/>
+              </w:rPr>
+              <w:t xml:space="preserve">working days</w:t>
             </w:r>
             <w:r>
               <w:rPr>
@@ -6784,6 +6886,15 @@
             </w:r>
             <w:r>
               <w:rPr>
+                <w:color w:val="1f2a26"/>
+                <w:sz w:val="19"/>
+                <w:szCs w:val="19"/>
+                <w:rtl w:val="0"/>
+              </w:rPr>
+              <w:t xml:space="preserve">N/A</w:t>
+            </w:r>
+            <w:r>
+              <w:rPr>
                 <w:rtl w:val="0"/>
               </w:rPr>
             </w:r>
@@ -6887,7 +6998,7 @@
                 <w:szCs w:val="19"/>
                 <w:rtl w:val="0"/>
               </w:rPr>
-              <w:t xml:space="preserve"> </w:t>
+              <w:t xml:space="preserve"> N/A</w:t>
             </w:r>
             <w:r>
               <w:rPr>
@@ -6998,6 +7109,15 @@
             </w:r>
             <w:r>
               <w:rPr>
+                <w:color w:val="1f2a26"/>
+                <w:sz w:val="19"/>
+                <w:szCs w:val="19"/>
+                <w:rtl w:val="0"/>
+              </w:rPr>
+              <w:t xml:space="preserve">VISA, MASTER CARD , APPLE PAY, GOOGLE PAY, CREDIT CARD</w:t>
+            </w:r>
+            <w:r>
+              <w:rPr>
                 <w:rtl w:val="0"/>
               </w:rPr>
             </w:r>
@@ -7005,6 +7125,61 @@
         </w:tc>
       </w:tr>
     </w:tbl>
+    <w:p>
+      <w:pPr>
+        <w:spacing w:after="200" w:lineRule="auto"/>
+        <w:rPr/>
+      </w:pPr>
+      <w:r>
+        <w:rPr>
+          <w:rtl w:val="0"/>
+        </w:rPr>
+      </w:r>
+    </w:p>
+    <w:p>
+      <w:pPr>
+        <w:spacing w:after="200" w:lineRule="auto"/>
+        <w:rPr/>
+      </w:pPr>
+      <w:r>
+        <w:rPr>
+          <w:rtl w:val="0"/>
+        </w:rPr>
+      </w:r>
+    </w:p>
+    <w:p>
+      <w:pPr>
+        <w:spacing w:after="200" w:lineRule="auto"/>
+        <w:rPr/>
+      </w:pPr>
+      <w:r>
+        <w:rPr>
+          <w:rtl w:val="0"/>
+        </w:rPr>
+      </w:r>
+    </w:p>
+    <w:p>
+      <w:pPr>
+        <w:spacing w:after="200" w:lineRule="auto"/>
+        <w:rPr/>
+      </w:pPr>
+      <w:r>
+        <w:rPr>
+          <w:rtl w:val="0"/>
+        </w:rPr>
+      </w:r>
+    </w:p>
+    <w:p>
+      <w:pPr>
+        <w:spacing w:after="200" w:lineRule="auto"/>
+        <w:rPr/>
+      </w:pPr>
+      <w:r>
+        <w:rPr>
+          <w:rtl w:val="0"/>
+        </w:rPr>
+      </w:r>
+    </w:p>
     <w:p>
       <w:pPr>
         <w:spacing w:after="200" w:lineRule="auto"/>
@@ -7207,23 +7382,303 @@
           </w:tcPr>
           <w:p>
             <w:pPr>
+              <w:spacing w:before="40" w:lineRule="auto"/>
+              <w:rPr>
+                <w:color w:val="1f2a26"/>
+                <w:sz w:val="22"/>
+                <w:szCs w:val="22"/>
+              </w:rPr>
+            </w:pPr>
+            <w:r>
+              <w:rPr>
+                <w:color w:val="1f2a26"/>
+                <w:sz w:val="22"/>
+                <w:szCs w:val="22"/>
+                <w:rtl w:val="0"/>
+              </w:rPr>
+              <w:t xml:space="preserve">Calf</w:t>
+            </w:r>
+            <w:r>
+              <w:rPr>
+                <w:color w:val="1f2a26"/>
+                <w:sz w:val="22"/>
+                <w:szCs w:val="22"/>
+                <w:rtl w:val="0"/>
+              </w:rPr>
+              <w:t xml:space="preserve"> </w:t>
+            </w:r>
+            <w:r>
+              <w:rPr>
+                <w:color w:val="1f2a26"/>
+                <w:sz w:val="22"/>
+                <w:szCs w:val="22"/>
+                <w:rtl w:val="0"/>
+              </w:rPr>
+              <w:t xml:space="preserve">Leather</w:t>
+            </w:r>
+            <w:r>
+              <w:rPr>
+                <w:color w:val="1f2a26"/>
+                <w:sz w:val="22"/>
+                <w:szCs w:val="22"/>
+                <w:rtl w:val="0"/>
+              </w:rPr>
+              <w:t xml:space="preserve"> — </w:t>
+            </w:r>
+            <w:r>
+              <w:rPr>
+                <w:color w:val="1f2a26"/>
+                <w:sz w:val="22"/>
+                <w:szCs w:val="22"/>
+                <w:rtl w:val="1"/>
+              </w:rPr>
+              <w:t xml:space="preserve">جلد</w:t>
+            </w:r>
+            <w:r>
+              <w:rPr>
+                <w:color w:val="1f2a26"/>
+                <w:sz w:val="22"/>
+                <w:szCs w:val="22"/>
+                <w:rtl w:val="1"/>
+              </w:rPr>
+              <w:t xml:space="preserve"> </w:t>
+            </w:r>
+            <w:r>
+              <w:rPr>
+                <w:color w:val="1f2a26"/>
+                <w:sz w:val="22"/>
+                <w:szCs w:val="22"/>
+                <w:rtl w:val="1"/>
+              </w:rPr>
+              <w:t xml:space="preserve">عجل</w:t>
+            </w:r>
+          </w:p>
+          <w:p>
+            <w:pPr>
+              <w:spacing w:before="40" w:lineRule="auto"/>
+              <w:rPr>
+                <w:color w:val="1f2a26"/>
+                <w:sz w:val="22"/>
+                <w:szCs w:val="22"/>
+              </w:rPr>
+            </w:pPr>
+            <w:r>
+              <w:rPr>
+                <w:color w:val="1f2a26"/>
+                <w:sz w:val="22"/>
+                <w:szCs w:val="22"/>
+                <w:rtl w:val="0"/>
+              </w:rPr>
+              <w:t xml:space="preserve">Ostrich</w:t>
+            </w:r>
+            <w:r>
+              <w:rPr>
+                <w:color w:val="1f2a26"/>
+                <w:sz w:val="22"/>
+                <w:szCs w:val="22"/>
+                <w:rtl w:val="0"/>
+              </w:rPr>
+              <w:t xml:space="preserve"> </w:t>
+            </w:r>
+            <w:r>
+              <w:rPr>
+                <w:color w:val="1f2a26"/>
+                <w:sz w:val="22"/>
+                <w:szCs w:val="22"/>
+                <w:rtl w:val="0"/>
+              </w:rPr>
+              <w:t xml:space="preserve">Leather</w:t>
+            </w:r>
+            <w:r>
+              <w:rPr>
+                <w:color w:val="1f2a26"/>
+                <w:sz w:val="22"/>
+                <w:szCs w:val="22"/>
+                <w:rtl w:val="0"/>
+              </w:rPr>
+              <w:t xml:space="preserve"> — </w:t>
+            </w:r>
+            <w:r>
+              <w:rPr>
+                <w:color w:val="1f2a26"/>
+                <w:sz w:val="22"/>
+                <w:szCs w:val="22"/>
+                <w:rtl w:val="1"/>
+              </w:rPr>
+              <w:t xml:space="preserve">نعام</w:t>
+            </w:r>
+          </w:p>
+          <w:p>
+            <w:pPr>
+              <w:spacing w:before="40" w:lineRule="auto"/>
+              <w:rPr>
+                <w:color w:val="1f2a26"/>
+                <w:sz w:val="22"/>
+                <w:szCs w:val="22"/>
+              </w:rPr>
+            </w:pPr>
+            <w:r>
+              <w:rPr>
+                <w:color w:val="1f2a26"/>
+                <w:sz w:val="22"/>
+                <w:szCs w:val="22"/>
+                <w:rtl w:val="0"/>
+              </w:rPr>
+              <w:t xml:space="preserve">Crocodile</w:t>
+            </w:r>
+            <w:r>
+              <w:rPr>
+                <w:color w:val="1f2a26"/>
+                <w:sz w:val="22"/>
+                <w:szCs w:val="22"/>
+                <w:rtl w:val="0"/>
+              </w:rPr>
+              <w:t xml:space="preserve"> </w:t>
+            </w:r>
+            <w:r>
+              <w:rPr>
+                <w:color w:val="1f2a26"/>
+                <w:sz w:val="22"/>
+                <w:szCs w:val="22"/>
+                <w:rtl w:val="0"/>
+              </w:rPr>
+              <w:t xml:space="preserve">Leather</w:t>
+            </w:r>
+            <w:r>
+              <w:rPr>
+                <w:color w:val="1f2a26"/>
+                <w:sz w:val="22"/>
+                <w:szCs w:val="22"/>
+                <w:rtl w:val="0"/>
+              </w:rPr>
+              <w:t xml:space="preserve"> — </w:t>
+            </w:r>
+            <w:r>
+              <w:rPr>
+                <w:color w:val="1f2a26"/>
+                <w:sz w:val="22"/>
+                <w:szCs w:val="22"/>
+                <w:rtl w:val="1"/>
+              </w:rPr>
+              <w:t xml:space="preserve">جلد</w:t>
+            </w:r>
+            <w:r>
+              <w:rPr>
+                <w:color w:val="1f2a26"/>
+                <w:sz w:val="22"/>
+                <w:szCs w:val="22"/>
+                <w:rtl w:val="1"/>
+              </w:rPr>
+              <w:t xml:space="preserve"> </w:t>
+            </w:r>
+            <w:r>
+              <w:rPr>
+                <w:color w:val="1f2a26"/>
+                <w:sz w:val="22"/>
+                <w:szCs w:val="22"/>
+                <w:rtl w:val="1"/>
+              </w:rPr>
+              <w:t xml:space="preserve">تمساح</w:t>
+            </w:r>
+          </w:p>
+          <w:p>
+            <w:pPr>
               <w:spacing w:after="0" w:before="40" w:lineRule="auto"/>
-              <w:rPr/>
-            </w:pPr>
-            <w:r>
-              <w:rPr>
-                <w:rFonts w:ascii="Calibri" w:cs="Calibri" w:eastAsia="Calibri" w:hAnsi="Calibri"/>
-                <w:color w:val="1f2a26"/>
-                <w:sz w:val="19"/>
-                <w:szCs w:val="19"/>
+              <w:rPr>
+                <w:color w:val="1f2a26"/>
+                <w:sz w:val="19"/>
+                <w:szCs w:val="19"/>
+              </w:rPr>
+            </w:pPr>
+            <w:r>
+              <w:rPr>
+                <w:color w:val="1f2a26"/>
+                <w:sz w:val="22"/>
+                <w:szCs w:val="22"/>
+                <w:rtl w:val="0"/>
+              </w:rPr>
+              <w:t xml:space="preserve">Exotic</w:t>
+            </w:r>
+            <w:r>
+              <w:rPr>
+                <w:color w:val="1f2a26"/>
+                <w:sz w:val="22"/>
+                <w:szCs w:val="22"/>
                 <w:rtl w:val="0"/>
               </w:rPr>
               <w:t xml:space="preserve"> </w:t>
             </w:r>
             <w:r>
               <w:rPr>
-                <w:rtl w:val="0"/>
-              </w:rPr>
+                <w:color w:val="1f2a26"/>
+                <w:sz w:val="22"/>
+                <w:szCs w:val="22"/>
+                <w:rtl w:val="0"/>
+              </w:rPr>
+              <w:t xml:space="preserve">Leather</w:t>
+            </w:r>
+            <w:r>
+              <w:rPr>
+                <w:color w:val="1f2a26"/>
+                <w:sz w:val="22"/>
+                <w:szCs w:val="22"/>
+                <w:rtl w:val="0"/>
+              </w:rPr>
+              <w:t xml:space="preserve"> — </w:t>
+            </w:r>
+            <w:r>
+              <w:rPr>
+                <w:color w:val="1f2a26"/>
+                <w:sz w:val="22"/>
+                <w:szCs w:val="22"/>
+                <w:rtl w:val="1"/>
+              </w:rPr>
+              <w:t xml:space="preserve">جلود</w:t>
+            </w:r>
+            <w:r>
+              <w:rPr>
+                <w:color w:val="1f2a26"/>
+                <w:sz w:val="22"/>
+                <w:szCs w:val="22"/>
+                <w:rtl w:val="1"/>
+              </w:rPr>
+              <w:t xml:space="preserve"> </w:t>
+            </w:r>
+            <w:r>
+              <w:rPr>
+                <w:color w:val="1f2a26"/>
+                <w:sz w:val="22"/>
+                <w:szCs w:val="22"/>
+                <w:rtl w:val="1"/>
+              </w:rPr>
+              <w:t xml:space="preserve">فاخرة</w:t>
+            </w:r>
+            <w:r>
+              <w:rPr>
+                <w:color w:val="1f2a26"/>
+                <w:sz w:val="22"/>
+                <w:szCs w:val="22"/>
+                <w:rtl w:val="1"/>
+              </w:rPr>
+              <w:t xml:space="preserve"> </w:t>
+            </w:r>
+            <w:r>
+              <w:rPr>
+                <w:color w:val="1f2a26"/>
+                <w:sz w:val="22"/>
+                <w:szCs w:val="22"/>
+                <w:rtl w:val="1"/>
+              </w:rPr>
+              <w:t xml:space="preserve">ونادرة</w:t>
+            </w:r>
+            <w:r>
+              <w:rPr>
+                <w:color w:val="1f2a26"/>
+                <w:sz w:val="19"/>
+                <w:szCs w:val="19"/>
+                <w:rtl w:val="0"/>
+              </w:rPr>
+              <w:t xml:space="preserve"> </w:t>
             </w:r>
           </w:p>
         </w:tc>
@@ -7319,6 +7774,11 @@
             </w:pPr>
             <w:r>
               <w:rPr>
+                <w:rtl w:val="0"/>
+              </w:rPr>
+            </w:r>
+            <w:r>
+              <w:rPr>
                 <w:rFonts w:ascii="Calibri" w:cs="Calibri" w:eastAsia="Calibri" w:hAnsi="Calibri"/>
                 <w:color w:val="1f2a26"/>
                 <w:sz w:val="19"/>
@@ -7326,6 +7786,85 @@
                 <w:rtl w:val="0"/>
               </w:rPr>
               <w:t xml:space="preserve"> </w:t>
+            </w:r>
+            <w:r>
+              <w:rPr>
+                <w:rFonts w:ascii="Calibri" w:cs="Calibri" w:eastAsia="Calibri" w:hAnsi="Calibri"/>
+                <w:color w:val="1f2a26"/>
+                <w:sz w:val="19"/>
+                <w:szCs w:val="19"/>
+                <w:rtl w:val="0"/>
+              </w:rPr>
+              <w:t xml:space="preserve">Arabic</w:t>
+            </w:r>
+            <w:r>
+              <w:rPr>
+                <w:rFonts w:ascii="Calibri" w:cs="Calibri" w:eastAsia="Calibri" w:hAnsi="Calibri"/>
+                <w:color w:val="1f2a26"/>
+                <w:sz w:val="19"/>
+                <w:szCs w:val="19"/>
+                <w:rtl w:val="0"/>
+              </w:rPr>
+              <w:t xml:space="preserve"> </w:t>
+            </w:r>
+            <w:r>
+              <w:rPr>
+                <w:rFonts w:ascii="Calibri" w:cs="Calibri" w:eastAsia="Calibri" w:hAnsi="Calibri"/>
+                <w:color w:val="1f2a26"/>
+                <w:sz w:val="19"/>
+                <w:szCs w:val="19"/>
+                <w:rtl w:val="0"/>
+              </w:rPr>
+              <w:t xml:space="preserve">sandal</w:t>
+            </w:r>
+            <w:r>
+              <w:rPr>
+                <w:rFonts w:ascii="Calibri" w:cs="Calibri" w:eastAsia="Calibri" w:hAnsi="Calibri"/>
+                <w:color w:val="1f2a26"/>
+                <w:sz w:val="19"/>
+                <w:szCs w:val="19"/>
+                <w:rtl w:val="0"/>
+              </w:rPr>
+              <w:t xml:space="preserve">      </w:t>
+            </w:r>
+            <w:r>
+              <w:rPr>
+                <w:rFonts w:ascii="Calibri" w:cs="Calibri" w:eastAsia="Calibri" w:hAnsi="Calibri"/>
+                <w:color w:val="1f2a26"/>
+                <w:sz w:val="19"/>
+                <w:szCs w:val="19"/>
+                <w:rtl w:val="1"/>
+              </w:rPr>
+              <w:t xml:space="preserve">نعال</w:t>
+            </w:r>
+            <w:r>
+              <w:rPr>
+                <w:rFonts w:ascii="Calibri" w:cs="Calibri" w:eastAsia="Calibri" w:hAnsi="Calibri"/>
+                <w:color w:val="1f2a26"/>
+                <w:sz w:val="19"/>
+                <w:szCs w:val="19"/>
+                <w:rtl w:val="0"/>
+              </w:rPr>
+              <w:t xml:space="preserve"> </w:t>
+            </w:r>
+            <w:r>
+              <w:rPr>
+                <w:color w:val="1f2a26"/>
+                <w:sz w:val="19"/>
+                <w:szCs w:val="19"/>
+                <w:rtl w:val="0"/>
+              </w:rPr>
+              <w:t xml:space="preserve"> / </w:t>
+            </w:r>
+            <w:r>
+              <w:rPr>
+                <w:rFonts w:ascii="Calibri" w:cs="Calibri" w:eastAsia="Calibri" w:hAnsi="Calibri"/>
+                <w:color w:val="1f2a26"/>
+                <w:sz w:val="19"/>
+                <w:szCs w:val="19"/>
+                <w:rtl w:val="1"/>
+              </w:rPr>
+              <w:t xml:space="preserve">صندل</w:t>
             </w:r>
             <w:r>
               <w:rPr>
@@ -7411,7 +7950,7 @@
                 <w:szCs w:val="19"/>
                 <w:rtl w:val="0"/>
               </w:rPr>
-              <w:t xml:space="preserve"> </w:t>
+              <w:t xml:space="preserve"> QATAR</w:t>
             </w:r>
             <w:r>
               <w:rPr>
@@ -7497,7 +8036,16 @@
                 <w:szCs w:val="19"/>
                 <w:rtl w:val="0"/>
               </w:rPr>
-              <w:t xml:space="preserve"> </w:t>
+              <w:t xml:space="preserve"> ITA</w:t>
+            </w:r>
+            <w:r>
+              <w:rPr>
+                <w:color w:val="1f2a26"/>
+                <w:sz w:val="19"/>
+                <w:szCs w:val="19"/>
+                <w:rtl w:val="0"/>
+              </w:rPr>
+              <w:t xml:space="preserve">LY</w:t>
             </w:r>
             <w:r>
               <w:rPr>
@@ -7604,7 +8152,7 @@
                 <w:szCs w:val="19"/>
                 <w:rtl w:val="0"/>
               </w:rPr>
-              <w:t xml:space="preserve"> </w:t>
+              <w:t xml:space="preserve"> MENS AND KIDS</w:t>
             </w:r>
             <w:r>
               <w:rPr>
@@ -7797,7 +8345,11 @@
           <w:p>
             <w:pPr>
               <w:spacing w:after="0" w:before="40" w:lineRule="auto"/>
-              <w:rPr/>
+              <w:rPr>
+                <w:color w:val="1f2a26"/>
+                <w:sz w:val="19"/>
+                <w:szCs w:val="19"/>
+              </w:rPr>
             </w:pPr>
             <w:r>
               <w:rPr>
@@ -7809,10 +8361,56 @@
               </w:rPr>
               <w:t xml:space="preserve"> </w:t>
             </w:r>
-            <w:r>
-              <w:rPr>
-                <w:rtl w:val="0"/>
-              </w:rPr>
+            <w:hyperlink r:id="rId9">
+              <w:r>
+                <w:rPr>
+                  <w:rFonts w:ascii="Calibri" w:cs="Calibri" w:eastAsia="Calibri" w:hAnsi="Calibri"/>
+                  <w:color w:val="1155cc"/>
+                  <w:sz w:val="19"/>
+                  <w:szCs w:val="19"/>
+                  <w:u w:val="single"/>
+                  <w:rtl w:val="0"/>
+                </w:rPr>
+                <w:t xml:space="preserve">https://www.instagram.com/elitecollection.qa?stkn=MW02MHloY2E5NGxleA==</w:t>
+              </w:r>
+            </w:hyperlink>
+            <w:r>
+              <w:rPr>
+                <w:rFonts w:ascii="Calibri" w:cs="Calibri" w:eastAsia="Calibri" w:hAnsi="Calibri"/>
+                <w:color w:val="1f2a26"/>
+                <w:sz w:val="19"/>
+                <w:szCs w:val="19"/>
+                <w:rtl w:val="0"/>
+              </w:rPr>
+              <w:t xml:space="preserve"> </w:t>
+            </w:r>
+            <w:r>
+              <w:rPr>
+                <w:color w:val="1f2a26"/>
+                <w:sz w:val="19"/>
+                <w:szCs w:val="19"/>
+                <w:rtl w:val="0"/>
+              </w:rPr>
+              <w:t xml:space="preserve">  </w:t>
+            </w:r>
+          </w:p>
+          <w:p>
+            <w:pPr>
+              <w:spacing w:after="0" w:before="40" w:lineRule="auto"/>
+              <w:rPr>
+                <w:color w:val="1f2a26"/>
+                <w:sz w:val="19"/>
+                <w:szCs w:val="19"/>
+              </w:rPr>
+            </w:pPr>
+            <w:r>
+              <w:rPr>
+                <w:color w:val="1f2a26"/>
+                <w:sz w:val="19"/>
+                <w:szCs w:val="19"/>
+                <w:rtl w:val="0"/>
+              </w:rPr>
+              <w:t xml:space="preserve">elitecollection.qa</w:t>
             </w:r>
           </w:p>
         </w:tc>
@@ -8672,6 +9270,39 @@
         </w:tc>
       </w:tr>
     </w:tbl>
+    <w:p>
+      <w:pPr>
+        <w:spacing w:after="200" w:lineRule="auto"/>
+        <w:rPr/>
+      </w:pPr>
+      <w:r>
+        <w:rPr>
+          <w:rtl w:val="0"/>
+        </w:rPr>
+      </w:r>
+    </w:p>
+    <w:p>
+      <w:pPr>
+        <w:spacing w:after="200" w:lineRule="auto"/>
+        <w:rPr/>
+      </w:pPr>
+      <w:r>
+        <w:rPr>
+          <w:rtl w:val="0"/>
+        </w:rPr>
+      </w:r>
+    </w:p>
+    <w:p>
+      <w:pPr>
+        <w:spacing w:after="200" w:lineRule="auto"/>
+        <w:rPr/>
+      </w:pPr>
+      <w:r>
+        <w:rPr>
+          <w:rtl w:val="0"/>
+        </w:rPr>
+      </w:r>
+    </w:p>
     <w:p>
       <w:pPr>
         <w:spacing w:after="200" w:lineRule="auto"/>
@@ -8874,18 +9505,430 @@
           </w:tcPr>
           <w:p>
             <w:pPr>
+              <w:bidi w:val="1"/>
+              <w:spacing w:before="40" w:lineRule="auto"/>
+              <w:jc w:val="center"/>
+              <w:rPr>
+                <w:sz w:val="24"/>
+                <w:szCs w:val="24"/>
+              </w:rPr>
+            </w:pPr>
+            <w:r>
+              <w:rPr>
+                <w:sz w:val="24"/>
+                <w:szCs w:val="24"/>
+                <w:rtl w:val="1"/>
+              </w:rPr>
+              <w:t xml:space="preserve">نعال</w:t>
+            </w:r>
+          </w:p>
+          <w:p>
+            <w:pPr>
+              <w:spacing w:before="40" w:lineRule="auto"/>
+              <w:jc w:val="center"/>
+              <w:rPr>
+                <w:sz w:val="24"/>
+                <w:szCs w:val="24"/>
+              </w:rPr>
+            </w:pPr>
+            <w:r>
+              <w:rPr>
+                <w:sz w:val="24"/>
+                <w:szCs w:val="24"/>
+                <w:rtl w:val="0"/>
+              </w:rPr>
+              <w:t xml:space="preserve">medical</w:t>
+            </w:r>
+            <w:r>
+              <w:rPr>
+                <w:sz w:val="24"/>
+                <w:szCs w:val="24"/>
+                <w:rtl w:val="0"/>
+              </w:rPr>
+              <w:t xml:space="preserve"> </w:t>
+            </w:r>
+            <w:r>
+              <w:rPr>
+                <w:sz w:val="24"/>
+                <w:szCs w:val="24"/>
+                <w:rtl w:val="0"/>
+              </w:rPr>
+              <w:t xml:space="preserve">Sandal</w:t>
+            </w:r>
+            <w:r>
+              <w:rPr>
+                <w:sz w:val="24"/>
+                <w:szCs w:val="24"/>
+                <w:rtl w:val="0"/>
+              </w:rPr>
+              <w:t xml:space="preserve"> - </w:t>
+            </w:r>
+            <w:r>
+              <w:rPr>
+                <w:sz w:val="24"/>
+                <w:szCs w:val="24"/>
+                <w:rtl w:val="1"/>
+              </w:rPr>
+              <w:t xml:space="preserve">نعال</w:t>
+            </w:r>
+            <w:r>
+              <w:rPr>
+                <w:sz w:val="24"/>
+                <w:szCs w:val="24"/>
+                <w:rtl w:val="1"/>
+              </w:rPr>
+              <w:t xml:space="preserve"> </w:t>
+            </w:r>
+            <w:r>
+              <w:rPr>
+                <w:sz w:val="24"/>
+                <w:szCs w:val="24"/>
+                <w:rtl w:val="1"/>
+              </w:rPr>
+              <w:t xml:space="preserve">طبي</w:t>
+            </w:r>
+          </w:p>
+          <w:p>
+            <w:pPr>
+              <w:spacing w:before="40" w:lineRule="auto"/>
+              <w:jc w:val="center"/>
+              <w:rPr>
+                <w:sz w:val="24"/>
+                <w:szCs w:val="24"/>
+              </w:rPr>
+            </w:pPr>
+            <w:r>
+              <w:rPr>
+                <w:sz w:val="24"/>
+                <w:szCs w:val="24"/>
+                <w:rtl w:val="0"/>
+              </w:rPr>
+              <w:t xml:space="preserve">Classic</w:t>
+            </w:r>
+            <w:r>
+              <w:rPr>
+                <w:sz w:val="24"/>
+                <w:szCs w:val="24"/>
+                <w:rtl w:val="0"/>
+              </w:rPr>
+              <w:t xml:space="preserve"> </w:t>
+            </w:r>
+            <w:r>
+              <w:rPr>
+                <w:sz w:val="24"/>
+                <w:szCs w:val="24"/>
+                <w:rtl w:val="0"/>
+              </w:rPr>
+              <w:t xml:space="preserve">Sandal</w:t>
+            </w:r>
+            <w:r>
+              <w:rPr>
+                <w:sz w:val="24"/>
+                <w:szCs w:val="24"/>
+                <w:rtl w:val="0"/>
+              </w:rPr>
+              <w:t xml:space="preserve"> - </w:t>
+            </w:r>
+            <w:r>
+              <w:rPr>
+                <w:sz w:val="24"/>
+                <w:szCs w:val="24"/>
+                <w:rtl w:val="1"/>
+              </w:rPr>
+              <w:t xml:space="preserve">نعال</w:t>
+            </w:r>
+            <w:r>
+              <w:rPr>
+                <w:sz w:val="24"/>
+                <w:szCs w:val="24"/>
+                <w:rtl w:val="1"/>
+              </w:rPr>
+              <w:t xml:space="preserve"> </w:t>
+            </w:r>
+            <w:r>
+              <w:rPr>
+                <w:sz w:val="24"/>
+                <w:szCs w:val="24"/>
+                <w:rtl w:val="1"/>
+              </w:rPr>
+              <w:t xml:space="preserve">كلاسيك</w:t>
+            </w:r>
+          </w:p>
+          <w:p>
+            <w:pPr>
+              <w:spacing w:before="40" w:lineRule="auto"/>
+              <w:jc w:val="center"/>
+              <w:rPr>
+                <w:sz w:val="24"/>
+                <w:szCs w:val="24"/>
+              </w:rPr>
+            </w:pPr>
+            <w:r>
+              <w:rPr>
+                <w:rtl w:val="0"/>
+              </w:rPr>
+            </w:r>
+            <w:r>
+              <w:rPr>
+                <w:sz w:val="24"/>
+                <w:szCs w:val="24"/>
+                <w:rtl w:val="0"/>
+              </w:rPr>
+              <w:t xml:space="preserve"> </w:t>
+            </w:r>
+            <w:r>
+              <w:rPr>
+                <w:sz w:val="24"/>
+                <w:szCs w:val="24"/>
+                <w:rtl w:val="0"/>
+              </w:rPr>
+              <w:t xml:space="preserve">Genuine</w:t>
+            </w:r>
+            <w:r>
+              <w:rPr>
+                <w:sz w:val="24"/>
+                <w:szCs w:val="24"/>
+                <w:rtl w:val="0"/>
+              </w:rPr>
+              <w:t xml:space="preserve"> </w:t>
+            </w:r>
+            <w:r>
+              <w:rPr>
+                <w:sz w:val="24"/>
+                <w:szCs w:val="24"/>
+                <w:rtl w:val="0"/>
+              </w:rPr>
+              <w:t xml:space="preserve">Leather</w:t>
+            </w:r>
+            <w:r>
+              <w:rPr>
+                <w:sz w:val="24"/>
+                <w:szCs w:val="24"/>
+                <w:rtl w:val="0"/>
+              </w:rPr>
+              <w:t xml:space="preserve"> - </w:t>
+            </w:r>
+            <w:r>
+              <w:rPr>
+                <w:sz w:val="24"/>
+                <w:szCs w:val="24"/>
+                <w:rtl w:val="1"/>
+              </w:rPr>
+              <w:t xml:space="preserve">جلد</w:t>
+            </w:r>
+            <w:r>
+              <w:rPr>
+                <w:sz w:val="24"/>
+                <w:szCs w:val="24"/>
+                <w:rtl w:val="1"/>
+              </w:rPr>
+              <w:t xml:space="preserve"> </w:t>
+            </w:r>
+            <w:r>
+              <w:rPr>
+                <w:sz w:val="24"/>
+                <w:szCs w:val="24"/>
+                <w:rtl w:val="1"/>
+              </w:rPr>
+              <w:t xml:space="preserve">طبيعي</w:t>
+            </w:r>
+          </w:p>
+          <w:p>
+            <w:pPr>
+              <w:spacing w:before="40" w:lineRule="auto"/>
+              <w:jc w:val="center"/>
+              <w:rPr>
+                <w:sz w:val="24"/>
+                <w:szCs w:val="24"/>
+              </w:rPr>
+            </w:pPr>
+            <w:r>
+              <w:rPr>
+                <w:sz w:val="24"/>
+                <w:szCs w:val="24"/>
+                <w:rtl w:val="0"/>
+              </w:rPr>
+              <w:t xml:space="preserve">Sandal</w:t>
+            </w:r>
+            <w:r>
+              <w:rPr>
+                <w:sz w:val="24"/>
+                <w:szCs w:val="24"/>
+                <w:rtl w:val="0"/>
+              </w:rPr>
+              <w:t xml:space="preserve"> - </w:t>
+            </w:r>
+            <w:r>
+              <w:rPr>
+                <w:sz w:val="24"/>
+                <w:szCs w:val="24"/>
+                <w:rtl w:val="1"/>
+              </w:rPr>
+              <w:t xml:space="preserve">صندل</w:t>
+            </w:r>
+          </w:p>
+          <w:p>
+            <w:pPr>
               <w:spacing w:after="0" w:before="40" w:lineRule="auto"/>
-              <w:rPr/>
-            </w:pPr>
-            <w:r>
-              <w:rPr>
-                <w:rFonts w:ascii="Calibri" w:cs="Calibri" w:eastAsia="Calibri" w:hAnsi="Calibri"/>
-                <w:color w:val="1f2a26"/>
-                <w:sz w:val="19"/>
-                <w:szCs w:val="19"/>
+              <w:jc w:val="center"/>
+              <w:rPr>
+                <w:sz w:val="24"/>
+                <w:szCs w:val="24"/>
+              </w:rPr>
+            </w:pPr>
+            <w:r>
+              <w:rPr>
+                <w:sz w:val="24"/>
+                <w:szCs w:val="24"/>
+                <w:rtl w:val="0"/>
+              </w:rPr>
+              <w:t xml:space="preserve">Black</w:t>
+            </w:r>
+            <w:r>
+              <w:rPr>
+                <w:sz w:val="24"/>
+                <w:szCs w:val="24"/>
                 <w:rtl w:val="0"/>
               </w:rPr>
               <w:t xml:space="preserve"> </w:t>
+            </w:r>
+            <w:r>
+              <w:rPr>
+                <w:sz w:val="24"/>
+                <w:szCs w:val="24"/>
+                <w:rtl w:val="0"/>
+              </w:rPr>
+              <w:t xml:space="preserve">Sandal</w:t>
+            </w:r>
+            <w:r>
+              <w:rPr>
+                <w:sz w:val="24"/>
+                <w:szCs w:val="24"/>
+                <w:rtl w:val="0"/>
+              </w:rPr>
+              <w:t xml:space="preserve"> - </w:t>
+            </w:r>
+            <w:r>
+              <w:rPr>
+                <w:sz w:val="24"/>
+                <w:szCs w:val="24"/>
+                <w:rtl w:val="1"/>
+              </w:rPr>
+              <w:t xml:space="preserve">نعال</w:t>
+            </w:r>
+            <w:r>
+              <w:rPr>
+                <w:sz w:val="24"/>
+                <w:szCs w:val="24"/>
+                <w:rtl w:val="1"/>
+              </w:rPr>
+              <w:t xml:space="preserve"> </w:t>
+            </w:r>
+            <w:r>
+              <w:rPr>
+                <w:sz w:val="24"/>
+                <w:szCs w:val="24"/>
+                <w:rtl w:val="1"/>
+              </w:rPr>
+              <w:t xml:space="preserve">أسود</w:t>
+            </w:r>
+          </w:p>
+          <w:p>
+            <w:pPr>
+              <w:bidi w:val="1"/>
+              <w:spacing w:after="0" w:before="40" w:lineRule="auto"/>
+              <w:jc w:val="center"/>
+              <w:rPr>
+                <w:sz w:val="24"/>
+                <w:szCs w:val="24"/>
+              </w:rPr>
+            </w:pPr>
+            <w:r>
+              <w:rPr>
+                <w:sz w:val="24"/>
+                <w:szCs w:val="24"/>
+                <w:rtl w:val="1"/>
+              </w:rPr>
+              <w:t xml:space="preserve">جلد</w:t>
+            </w:r>
+            <w:r>
+              <w:rPr>
+                <w:sz w:val="24"/>
+                <w:szCs w:val="24"/>
+                <w:rtl w:val="1"/>
+              </w:rPr>
+              <w:t xml:space="preserve"> </w:t>
+            </w:r>
+            <w:r>
+              <w:rPr>
+                <w:sz w:val="24"/>
+                <w:szCs w:val="24"/>
+                <w:rtl w:val="1"/>
+              </w:rPr>
+              <w:t xml:space="preserve">إيطالي</w:t>
+            </w:r>
+            <w:r>
+              <w:rPr>
+                <w:sz w:val="24"/>
+                <w:szCs w:val="24"/>
+                <w:rtl w:val="1"/>
+              </w:rPr>
+              <w:t xml:space="preserve"> - </w:t>
+            </w:r>
+            <w:r>
+              <w:rPr>
+                <w:sz w:val="24"/>
+                <w:szCs w:val="24"/>
+                <w:rtl w:val="0"/>
+              </w:rPr>
+              <w:t xml:space="preserve">italian</w:t>
+            </w:r>
+            <w:r>
+              <w:rPr>
+                <w:sz w:val="24"/>
+                <w:szCs w:val="24"/>
+                <w:rtl w:val="0"/>
+              </w:rPr>
+              <w:t xml:space="preserve"> </w:t>
+            </w:r>
+            <w:r>
+              <w:rPr>
+                <w:sz w:val="24"/>
+                <w:szCs w:val="24"/>
+                <w:rtl w:val="0"/>
+              </w:rPr>
+              <w:t xml:space="preserve">leather</w:t>
+            </w:r>
+            <w:r>
+              <w:rPr>
+                <w:rtl w:val="0"/>
+              </w:rPr>
+            </w:r>
+          </w:p>
+          <w:p>
+            <w:pPr>
+              <w:bidi w:val="1"/>
+              <w:spacing w:after="0" w:before="40" w:lineRule="auto"/>
+              <w:jc w:val="center"/>
+              <w:rPr/>
+            </w:pPr>
+            <w:r>
+              <w:rPr>
+                <w:rtl w:val="1"/>
+              </w:rPr>
+              <w:t xml:space="preserve">نعال</w:t>
+            </w:r>
+            <w:r>
+              <w:rPr>
+                <w:rtl w:val="1"/>
+              </w:rPr>
+              <w:t xml:space="preserve"> </w:t>
+            </w:r>
+            <w:r>
+              <w:rPr>
+                <w:rtl w:val="1"/>
+              </w:rPr>
+              <w:t xml:space="preserve">خفيف</w:t>
             </w:r>
             <w:r>
               <w:rPr>
@@ -8982,7 +10025,12 @@
           <w:p>
             <w:pPr>
               <w:spacing w:after="0" w:before="40" w:lineRule="auto"/>
-              <w:rPr/>
+              <w:rPr>
+                <w:rFonts w:ascii="Calibri" w:cs="Calibri" w:eastAsia="Calibri" w:hAnsi="Calibri"/>
+                <w:color w:val="1f2a26"/>
+                <w:sz w:val="19"/>
+                <w:szCs w:val="19"/>
+              </w:rPr>
             </w:pPr>
             <w:r>
               <w:rPr>
@@ -8994,6 +10042,125 @@
               </w:rPr>
               <w:t xml:space="preserve"> </w:t>
             </w:r>
+            <w:r>
+              <w:rPr>
+                <w:color w:val="1f2a26"/>
+                <w:sz w:val="19"/>
+                <w:szCs w:val="19"/>
+                <w:rtl w:val="0"/>
+              </w:rPr>
+              <w:t xml:space="preserve">P</w:t>
+            </w:r>
+            <w:r>
+              <w:rPr>
+                <w:rFonts w:ascii="Calibri" w:cs="Calibri" w:eastAsia="Calibri" w:hAnsi="Calibri"/>
+                <w:color w:val="1f2a26"/>
+                <w:sz w:val="19"/>
+                <w:szCs w:val="19"/>
+                <w:rtl w:val="0"/>
+              </w:rPr>
+              <w:t xml:space="preserve">rivate collection </w:t>
+            </w:r>
+            <w:hyperlink r:id="rId10">
+              <w:r>
+                <w:rPr>
+                  <w:rFonts w:ascii="Calibri" w:cs="Calibri" w:eastAsia="Calibri" w:hAnsi="Calibri"/>
+                  <w:color w:val="1155cc"/>
+                  <w:sz w:val="19"/>
+                  <w:szCs w:val="19"/>
+                  <w:u w:val="single"/>
+                  <w:rtl w:val="0"/>
+                </w:rPr>
+                <w:t xml:space="preserve">privatecollection.qa</w:t>
+              </w:r>
+            </w:hyperlink>
+            <w:r>
+              <w:rPr>
+                <w:rFonts w:ascii="Calibri" w:cs="Calibri" w:eastAsia="Calibri" w:hAnsi="Calibri"/>
+                <w:color w:val="1f2a26"/>
+                <w:sz w:val="19"/>
+                <w:szCs w:val="19"/>
+                <w:rtl w:val="0"/>
+              </w:rPr>
+              <w:t xml:space="preserve"> </w:t>
+            </w:r>
+          </w:p>
+          <w:p>
+            <w:pPr>
+              <w:spacing w:after="0" w:before="40" w:lineRule="auto"/>
+              <w:rPr>
+                <w:color w:val="1f2a26"/>
+                <w:sz w:val="19"/>
+                <w:szCs w:val="19"/>
+              </w:rPr>
+            </w:pPr>
+            <w:r>
+              <w:rPr>
+                <w:color w:val="1f2a26"/>
+                <w:sz w:val="19"/>
+                <w:szCs w:val="19"/>
+                <w:rtl w:val="0"/>
+              </w:rPr>
+              <w:t xml:space="preserve">Armonico - </w:t>
+            </w:r>
+            <w:hyperlink r:id="rId11">
+              <w:r>
+                <w:rPr>
+                  <w:color w:val="1155cc"/>
+                  <w:sz w:val="19"/>
+                  <w:szCs w:val="19"/>
+                  <w:u w:val="single"/>
+                  <w:rtl w:val="0"/>
+                </w:rPr>
+                <w:t xml:space="preserve">www.armonicoitaly.com</w:t>
+              </w:r>
+            </w:hyperlink>
+            <w:r>
+              <w:rPr>
+                <w:color w:val="1f2a26"/>
+                <w:sz w:val="19"/>
+                <w:szCs w:val="19"/>
+                <w:rtl w:val="0"/>
+              </w:rPr>
+              <w:t xml:space="preserve"> </w:t>
+            </w:r>
+          </w:p>
+          <w:p>
+            <w:pPr>
+              <w:spacing w:after="0" w:before="40" w:lineRule="auto"/>
+              <w:rPr>
+                <w:color w:val="1f2a26"/>
+                <w:sz w:val="5"/>
+                <w:szCs w:val="5"/>
+              </w:rPr>
+            </w:pPr>
+            <w:r>
+              <w:rPr>
+                <w:sz w:val="22"/>
+                <w:szCs w:val="22"/>
+                <w:rtl w:val="0"/>
+              </w:rPr>
+              <w:t xml:space="preserve">Elegante</w:t>
+            </w:r>
+            <w:r>
+              <w:rPr>
+                <w:color w:val="1f2a26"/>
+                <w:sz w:val="5"/>
+                <w:szCs w:val="5"/>
+                <w:rtl w:val="0"/>
+              </w:rPr>
+              <w:t xml:space="preserve"> </w:t>
+            </w:r>
+          </w:p>
+          <w:p>
+            <w:pPr>
+              <w:spacing w:after="0" w:before="40" w:lineRule="auto"/>
+              <w:rPr>
+                <w:color w:val="1f2a26"/>
+                <w:sz w:val="19"/>
+                <w:szCs w:val="19"/>
+              </w:rPr>
+            </w:pPr>
             <w:r>
               <w:rPr>
                 <w:rtl w:val="0"/>
@@ -9078,7 +10245,16 @@
                 <w:szCs w:val="19"/>
                 <w:rtl w:val="0"/>
               </w:rPr>
-              <w:t xml:space="preserve"> </w:t>
+              <w:t xml:space="preserve"> 1493 - </w:t>
+            </w:r>
+            <w:r>
+              <w:rPr>
+                <w:color w:val="1f2a26"/>
+                <w:sz w:val="19"/>
+                <w:szCs w:val="19"/>
+                <w:rtl w:val="0"/>
+              </w:rPr>
+              <w:t xml:space="preserve">GF / 2738- LM / 8825</w:t>
             </w:r>
             <w:r>
               <w:rPr>
@@ -9186,6 +10362,15 @@
                 <w:rtl w:val="0"/>
               </w:rPr>
               <w:t xml:space="preserve"> </w:t>
+            </w:r>
+            <w:r>
+              <w:rPr>
+                <w:color w:val="1f2a26"/>
+                <w:sz w:val="19"/>
+                <w:szCs w:val="19"/>
+                <w:rtl w:val="0"/>
+              </w:rPr>
+              <w:t xml:space="preserve">GCC</w:t>
             </w:r>
             <w:r>
               <w:rPr>
@@ -9526,7 +10711,7 @@
       </w:r>
     </w:p>
     <w:sectPr>
-      <w:footerReference r:id="rId9" w:type="default"/>
+      <w:footerReference r:id="rId12" w:type="default"/>
       <w:pgSz w:h="16838" w:w="11906" w:orient="portrait"/>
       <w:pgMar w:bottom="1180" w:top="1080" w:left="1270" w:right="1270" w:header="708" w:footer="708"/>
       <w:pgNumType w:start="1"/>

</xml_diff>